<commit_message>
feat: add cenas base
</commit_message>
<xml_diff>
--- a/SGDD - Guardioes do Bairro.docx
+++ b/SGDD - Guardioes do Bairro.docx
@@ -294,7 +294,9 @@
         </w:tc>
       </w:tr>
       <w:tr>
-        <w:trPr/>
+        <w:trPr>
+          <w:trHeight w:val="4193" w:hRule="atLeast"/>
+        </w:trPr>
         <w:tc>
           <w:tcPr>
             <w:tcW w:w="9628" w:type="dxa"/>

</xml_diff>